<commit_message>
Add v1.3 features: EUR/PLN currency, CS/DE languages, offer sorting, admin approve/reject/edit, send-to-client for senior/admin, offer names & search
Bundles all local, uncommitted v1.3 work (2026-07-08 through 2026-07-14) that
never shipped in the v1.2 deploy: settings-backed EUR/PLN currency switch
(offers freeze their own rate so later rate changes never alter a saved,
pending, or sent offer), Czech/German translations, sortable "My Offers",
admin approve/reject/edit buttons and send-to-client for senior/admin with
quick-filter tabs, optional offer names with an offer_<id> fallback plus
search across name/fallback/ID, and admin-equal permissions on the admin's
own offers. Updates README to describe the resulting v1.3 feature set.
</commit_message>
<xml_diff>
--- a/Historia wersji oraz md/Historia wersji/AMSteel_Quote_Raport_Wersji_1.2.docx
+++ b/Historia wersji oraz md/Historia wersji/AMSteel_Quote_Raport_Wersji_1.2.docx
@@ -208,18 +208,11 @@
             <w:tcW w:w="5669" w:type="dxa"/>
           </w:tcPr>
           <w:p>
-            <w:proofErr w:type="gramStart"/>
             <w:r>
               <w:rPr>
                 <w:color w:val="666666"/>
               </w:rPr>
               <w:t>13.07.2026 - 16.07.2026</w:t>
-            </w:r>
-            <w:proofErr w:type="gramEnd"/>
-            <w:r>
-              <w:rPr>
-                <w:color w:val="666666"/>
-              </w:rPr>
             </w:r>
           </w:p>
         </w:tc>
@@ -555,7 +548,7 @@
       <w:tr>
         <w:tc>
           <w:tcPr>
-            <w:tcW w:type="dxa" w:w="1226"/>
+            <w:tcW w:w="1226" w:type="dxa"/>
           </w:tcPr>
           <w:p>
             <w:r>
@@ -568,7 +561,7 @@
         </w:tc>
         <w:tc>
           <w:tcPr>
-            <w:tcW w:type="dxa" w:w="2481"/>
+            <w:tcW w:w="2481" w:type="dxa"/>
           </w:tcPr>
           <w:p>
             <w:r>
@@ -578,7 +571,7 @@
         </w:tc>
         <w:tc>
           <w:tcPr>
-            <w:tcW w:type="dxa" w:w="1568"/>
+            <w:tcW w:w="1568" w:type="dxa"/>
           </w:tcPr>
           <w:p>
             <w:r>
@@ -588,7 +581,7 @@
         </w:tc>
         <w:tc>
           <w:tcPr>
-            <w:tcW w:type="dxa" w:w="3581"/>
+            <w:tcW w:w="3581" w:type="dxa"/>
           </w:tcPr>
           <w:p>
             <w:r>
@@ -855,66 +848,39 @@
           <w:p>
             <w:proofErr w:type="spellStart"/>
             <w:r>
-              <w:rPr>
-                <w:color w:val="1F2A44"/>
-              </w:rPr>
               <w:t>Wersja</w:t>
             </w:r>
             <w:proofErr w:type="spellEnd"/>
             <w:r>
-              <w:rPr>
-                <w:color w:val="1F2A44"/>
-              </w:rPr>
               <w:t xml:space="preserve"> </w:t>
             </w:r>
             <w:proofErr w:type="spellStart"/>
             <w:proofErr w:type="gramStart"/>
             <w:r>
-              <w:rPr>
-                <w:color w:val="1F2A44"/>
-              </w:rPr>
               <w:t>bazowa</w:t>
             </w:r>
             <w:proofErr w:type="spellEnd"/>
             <w:r>
-              <w:rPr>
-                <w:color w:val="1F2A44"/>
-              </w:rPr>
               <w:t xml:space="preserve">  -</w:t>
             </w:r>
             <w:proofErr w:type="gramEnd"/>
             <w:r>
-              <w:rPr>
-                <w:color w:val="1F2A44"/>
-              </w:rPr>
               <w:t xml:space="preserve"> stan </w:t>
             </w:r>
             <w:proofErr w:type="spellStart"/>
             <w:r>
-              <w:rPr>
-                <w:color w:val="1F2A44"/>
-              </w:rPr>
               <w:t>wyjściowy</w:t>
             </w:r>
             <w:proofErr w:type="spellEnd"/>
             <w:r>
-              <w:rPr>
-                <w:color w:val="1F2A44"/>
-              </w:rPr>
               <w:t xml:space="preserve"> </w:t>
             </w:r>
             <w:proofErr w:type="spellStart"/>
             <w:r>
-              <w:rPr>
-                <w:color w:val="1F2A44"/>
-              </w:rPr>
               <w:t>aplikacji</w:t>
             </w:r>
             <w:proofErr w:type="spellEnd"/>
             <w:r>
-              <w:rPr>
-                <w:color w:val="1F2A44"/>
-              </w:rPr>
               <w:t>.</w:t>
             </w:r>
           </w:p>
@@ -936,7 +902,7 @@
           <w:color w:val="1F2A44"/>
           <w:sz w:val="32"/>
         </w:rPr>
-        <w:t>Zmiany w wersji 1.2</w:t>
+        <w:t>Zmiany</w:t>
       </w:r>
       <w:proofErr w:type="spellEnd"/>
       <w:r>
@@ -945,6 +911,7 @@
           <w:color w:val="1F2A44"/>
           <w:sz w:val="32"/>
         </w:rPr>
+        <w:t xml:space="preserve"> w </w:t>
       </w:r>
       <w:proofErr w:type="spellStart"/>
       <w:r>
@@ -953,6 +920,7 @@
           <w:color w:val="1F2A44"/>
           <w:sz w:val="32"/>
         </w:rPr>
+        <w:t>wersji</w:t>
       </w:r>
       <w:proofErr w:type="spellEnd"/>
       <w:r>
@@ -961,6 +929,7 @@
           <w:color w:val="1F2A44"/>
           <w:sz w:val="32"/>
         </w:rPr>
+        <w:t xml:space="preserve"> 1.2</w:t>
       </w:r>
     </w:p>
     <w:p>
@@ -1250,7 +1219,11 @@
           </w:tcPr>
           <w:p>
             <w:r>
-              <w:t>Porządki w repozytorium</w:t>
+              <w:t xml:space="preserve">Porządki w </w:t>
+            </w:r>
+            <w:r>
+              <w:lastRenderedPageBreak/>
+              <w:t>repozytorium</w:t>
             </w:r>
           </w:p>
         </w:tc>
@@ -1260,7 +1233,12 @@
           </w:tcPr>
           <w:p>
             <w:r>
-              <w:t>Repozytorium zsynchronizowane ze stanem produkcyjnym — usunięty rozjechany, nieużywany szkielet frontendu; kod w repo to teraz dokładnie to, co działa na produkcji.</w:t>
+              <w:lastRenderedPageBreak/>
+              <w:t xml:space="preserve">Repozytorium zsynchronizowane ze stanem produkcyjnym — usunięty </w:t>
+            </w:r>
+            <w:r>
+              <w:lastRenderedPageBreak/>
+              <w:t>rozjechany, nieużywany szkielet frontendu; kod w repo to teraz dokładnie to, co działa na produkcji.</w:t>
             </w:r>
           </w:p>
         </w:tc>
@@ -1272,6 +1250,7 @@
           </w:tcPr>
           <w:p>
             <w:r>
+              <w:lastRenderedPageBreak/>
               <w:t>Poprawka błędu budowania</w:t>
             </w:r>
           </w:p>
@@ -1575,8 +1554,8 @@
         <w:tblLook w:val="04A0" w:firstRow="1" w:lastRow="0" w:firstColumn="1" w:lastColumn="0" w:noHBand="0" w:noVBand="1"/>
       </w:tblPr>
       <w:tblGrid>
-        <w:gridCol w:w="1967"/>
-        <w:gridCol w:w="6889"/>
+        <w:gridCol w:w="1969"/>
+        <w:gridCol w:w="6887"/>
       </w:tblGrid>
       <w:tr>
         <w:tc>
@@ -1655,7 +1634,7 @@
       <w:tr>
         <w:tc>
           <w:tcPr>
-            <w:tcW w:type="dxa" w:w="1967"/>
+            <w:tcW w:w="1967" w:type="dxa"/>
           </w:tcPr>
           <w:p>
             <w:r>
@@ -1665,7 +1644,7 @@
         </w:tc>
         <w:tc>
           <w:tcPr>
-            <w:tcW w:type="dxa" w:w="6889"/>
+            <w:tcW w:w="6889" w:type="dxa"/>
           </w:tcPr>
           <w:p>
             <w:r>
@@ -1677,7 +1656,7 @@
       <w:tr>
         <w:tc>
           <w:tcPr>
-            <w:tcW w:type="dxa" w:w="1967"/>
+            <w:tcW w:w="1967" w:type="dxa"/>
           </w:tcPr>
           <w:p>
             <w:r>
@@ -1687,7 +1666,7 @@
         </w:tc>
         <w:tc>
           <w:tcPr>
-            <w:tcW w:type="dxa" w:w="6889"/>
+            <w:tcW w:w="6889" w:type="dxa"/>
           </w:tcPr>
           <w:p>
             <w:r>
@@ -1886,8 +1865,8 @@
         <w:tblLook w:val="04A0" w:firstRow="1" w:lastRow="0" w:firstColumn="1" w:lastColumn="0" w:noHBand="0" w:noVBand="1"/>
       </w:tblPr>
       <w:tblGrid>
-        <w:gridCol w:w="1944"/>
-        <w:gridCol w:w="6912"/>
+        <w:gridCol w:w="1951"/>
+        <w:gridCol w:w="6905"/>
       </w:tblGrid>
       <w:tr>
         <w:tc>
@@ -2129,8 +2108,8 @@
         <w:tblLook w:val="04A0" w:firstRow="1" w:lastRow="0" w:firstColumn="1" w:lastColumn="0" w:noHBand="0" w:noVBand="1"/>
       </w:tblPr>
       <w:tblGrid>
-        <w:gridCol w:w="1944"/>
-        <w:gridCol w:w="6912"/>
+        <w:gridCol w:w="1965"/>
+        <w:gridCol w:w="6891"/>
       </w:tblGrid>
       <w:tr>
         <w:tc>
@@ -2453,6 +2432,7 @@
           <w:color w:val="1F2A44"/>
           <w:sz w:val="26"/>
         </w:rPr>
+        <w:lastRenderedPageBreak/>
         <w:t>Znane</w:t>
       </w:r>
       <w:proofErr w:type="spellEnd"/>
@@ -2517,34 +2497,76 @@
       </w:pPr>
       <w:proofErr w:type="spellStart"/>
       <w:r>
-        <w:t>Powłoka (np. Z275) nie jest zapisywana per pozycja i nie pojawia się w eksporcie PDF</w:t>
-      </w:r>
-      <w:proofErr w:type="spellEnd"/>
-      <w:r/>
-      <w:proofErr w:type="spellStart"/>
-      <w:r/>
-      <w:proofErr w:type="spellEnd"/>
-      <w:r/>
-      <w:proofErr w:type="spellStart"/>
-      <w:r/>
-      <w:proofErr w:type="spellEnd"/>
-      <w:r/>
-      <w:proofErr w:type="spellStart"/>
-      <w:r/>
-      <w:proofErr w:type="spellEnd"/>
-      <w:r/>
-      <w:proofErr w:type="spellStart"/>
-      <w:r/>
-      <w:proofErr w:type="spellEnd"/>
-      <w:r/>
-      <w:proofErr w:type="spellStart"/>
-      <w:r/>
-      <w:proofErr w:type="spellEnd"/>
-      <w:r/>
-      <w:proofErr w:type="spellStart"/>
-      <w:r/>
-      <w:proofErr w:type="spellEnd"/>
-      <w:r/>
+        <w:t>Powłoka</w:t>
+      </w:r>
+      <w:proofErr w:type="spellEnd"/>
+      <w:r>
+        <w:t xml:space="preserve"> (np. Z275) </w:t>
+      </w:r>
+      <w:proofErr w:type="spellStart"/>
+      <w:r>
+        <w:t>nie</w:t>
+      </w:r>
+      <w:proofErr w:type="spellEnd"/>
+      <w:r>
+        <w:t xml:space="preserve"> jest </w:t>
+      </w:r>
+      <w:proofErr w:type="spellStart"/>
+      <w:r>
+        <w:t>zapisywana</w:t>
+      </w:r>
+      <w:proofErr w:type="spellEnd"/>
+      <w:r>
+        <w:t xml:space="preserve"> per </w:t>
+      </w:r>
+      <w:proofErr w:type="spellStart"/>
+      <w:r>
+        <w:t>pozycja</w:t>
+      </w:r>
+      <w:proofErr w:type="spellEnd"/>
+      <w:r>
+        <w:t xml:space="preserve"> </w:t>
+      </w:r>
+      <w:proofErr w:type="spellStart"/>
+      <w:r>
+        <w:t>i</w:t>
+      </w:r>
+      <w:proofErr w:type="spellEnd"/>
+      <w:r>
+        <w:t xml:space="preserve"> </w:t>
+      </w:r>
+      <w:proofErr w:type="spellStart"/>
+      <w:r>
+        <w:t>nie</w:t>
+      </w:r>
+      <w:proofErr w:type="spellEnd"/>
+      <w:r>
+        <w:t xml:space="preserve"> </w:t>
+      </w:r>
+      <w:proofErr w:type="spellStart"/>
+      <w:r>
+        <w:t>pojawia</w:t>
+      </w:r>
+      <w:proofErr w:type="spellEnd"/>
+      <w:r>
+        <w:t xml:space="preserve"> </w:t>
+      </w:r>
+      <w:proofErr w:type="spellStart"/>
+      <w:r>
+        <w:t>się</w:t>
+      </w:r>
+      <w:proofErr w:type="spellEnd"/>
+      <w:r>
+        <w:t xml:space="preserve"> w </w:t>
+      </w:r>
+      <w:proofErr w:type="spellStart"/>
+      <w:r>
+        <w:t>eksporcie</w:t>
+      </w:r>
+      <w:proofErr w:type="spellEnd"/>
+      <w:r>
+        <w:t xml:space="preserve"> PDF</w:t>
+      </w:r>
     </w:p>
     <w:p>
       <w:pPr>
@@ -2587,24 +2609,62 @@
       <w:pPr>
         <w:pStyle w:val="Listapunktowana"/>
       </w:pPr>
-      <w:proofErr w:type="spellStart"/>
-      <w:r>
-        <w:t>Import ofert z pliku Excel (format KTS/GPAO) — w toku, priorytet na najbliższy okres</w:t>
-      </w:r>
-      <w:proofErr w:type="spellEnd"/>
-      <w:r/>
-      <w:proofErr w:type="spellStart"/>
-      <w:r/>
-      <w:proofErr w:type="spellEnd"/>
-      <w:r/>
-      <w:proofErr w:type="spellStart"/>
-      <w:r/>
-      <w:proofErr w:type="spellEnd"/>
-      <w:r/>
-      <w:proofErr w:type="spellStart"/>
-      <w:r/>
-      <w:proofErr w:type="spellEnd"/>
-      <w:r/>
+      <w:r>
+        <w:t xml:space="preserve">Import </w:t>
+      </w:r>
+      <w:proofErr w:type="spellStart"/>
+      <w:r>
+        <w:t>ofert</w:t>
+      </w:r>
+      <w:proofErr w:type="spellEnd"/>
+      <w:r>
+        <w:t xml:space="preserve"> z </w:t>
+      </w:r>
+      <w:proofErr w:type="spellStart"/>
+      <w:r>
+        <w:t>pliku</w:t>
+      </w:r>
+      <w:proofErr w:type="spellEnd"/>
+      <w:r>
+        <w:t xml:space="preserve"> Excel (format KTS/GPAO) — w </w:t>
+      </w:r>
+      <w:proofErr w:type="spellStart"/>
+      <w:r>
+        <w:t>toku</w:t>
+      </w:r>
+      <w:proofErr w:type="spellEnd"/>
+      <w:r>
+        <w:t xml:space="preserve">, </w:t>
+      </w:r>
+      <w:proofErr w:type="spellStart"/>
+      <w:r>
+        <w:t>priorytet</w:t>
+      </w:r>
+      <w:proofErr w:type="spellEnd"/>
+      <w:r>
+        <w:t xml:space="preserve"> </w:t>
+      </w:r>
+      <w:proofErr w:type="spellStart"/>
+      <w:r>
+        <w:t>na</w:t>
+      </w:r>
+      <w:proofErr w:type="spellEnd"/>
+      <w:r>
+        <w:t xml:space="preserve"> </w:t>
+      </w:r>
+      <w:proofErr w:type="spellStart"/>
+      <w:r>
+        <w:t>najbliższy</w:t>
+      </w:r>
+      <w:proofErr w:type="spellEnd"/>
+      <w:r>
+        <w:t xml:space="preserve"> </w:t>
+      </w:r>
+      <w:proofErr w:type="spellStart"/>
+      <w:r>
+        <w:t>okres</w:t>
+      </w:r>
+      <w:proofErr w:type="spellEnd"/>
     </w:p>
     <w:p>
       <w:pPr>
@@ -2612,22 +2672,153 @@
       </w:pPr>
       <w:proofErr w:type="spellStart"/>
       <w:r>
-        <w:t>Hasła kont testowych o długości 4 znaków (celowo obniżone na czas testów) — docelowo wymaga blokady prób logowania zamiast podnoszenia wymogu długości</w:t>
-      </w:r>
-      <w:proofErr w:type="spellEnd"/>
-      <w:r/>
-      <w:proofErr w:type="spellStart"/>
-      <w:r/>
-      <w:proofErr w:type="spellEnd"/>
-      <w:r/>
-      <w:proofErr w:type="spellStart"/>
-      <w:r/>
-      <w:proofErr w:type="spellEnd"/>
-      <w:r/>
-      <w:proofErr w:type="spellStart"/>
-      <w:r/>
-      <w:proofErr w:type="spellEnd"/>
-      <w:r/>
+        <w:t>Hasła</w:t>
+      </w:r>
+      <w:proofErr w:type="spellEnd"/>
+      <w:r>
+        <w:t xml:space="preserve"> </w:t>
+      </w:r>
+      <w:proofErr w:type="spellStart"/>
+      <w:r>
+        <w:t>kont</w:t>
+      </w:r>
+      <w:proofErr w:type="spellEnd"/>
+      <w:r>
+        <w:t xml:space="preserve"> </w:t>
+      </w:r>
+      <w:proofErr w:type="spellStart"/>
+      <w:r>
+        <w:t>testowych</w:t>
+      </w:r>
+      <w:proofErr w:type="spellEnd"/>
+      <w:r>
+        <w:t xml:space="preserve"> o </w:t>
+      </w:r>
+      <w:proofErr w:type="spellStart"/>
+      <w:r>
+        <w:t>długości</w:t>
+      </w:r>
+      <w:proofErr w:type="spellEnd"/>
+      <w:r>
+        <w:t xml:space="preserve"> 4 </w:t>
+      </w:r>
+      <w:proofErr w:type="spellStart"/>
+      <w:r>
+        <w:t>znaków</w:t>
+      </w:r>
+      <w:proofErr w:type="spellEnd"/>
+      <w:r>
+        <w:t xml:space="preserve"> (</w:t>
+      </w:r>
+      <w:proofErr w:type="spellStart"/>
+      <w:r>
+        <w:t>celowo</w:t>
+      </w:r>
+      <w:proofErr w:type="spellEnd"/>
+      <w:r>
+        <w:t xml:space="preserve"> </w:t>
+      </w:r>
+      <w:proofErr w:type="spellStart"/>
+      <w:r>
+        <w:t>obniżone</w:t>
+      </w:r>
+      <w:proofErr w:type="spellEnd"/>
+      <w:r>
+        <w:t xml:space="preserve"> </w:t>
+      </w:r>
+      <w:proofErr w:type="spellStart"/>
+      <w:r>
+        <w:t>na</w:t>
+      </w:r>
+      <w:proofErr w:type="spellEnd"/>
+      <w:r>
+        <w:t xml:space="preserve"> </w:t>
+      </w:r>
+      <w:proofErr w:type="spellStart"/>
+      <w:r>
+        <w:t>czas</w:t>
+      </w:r>
+      <w:proofErr w:type="spellEnd"/>
+      <w:r>
+        <w:t xml:space="preserve"> </w:t>
+      </w:r>
+      <w:proofErr w:type="spellStart"/>
+      <w:r>
+        <w:t>testów</w:t>
+      </w:r>
+      <w:proofErr w:type="spellEnd"/>
+      <w:r>
+        <w:t xml:space="preserve">) — </w:t>
+      </w:r>
+      <w:proofErr w:type="spellStart"/>
+      <w:r>
+        <w:t>docelowo</w:t>
+      </w:r>
+      <w:proofErr w:type="spellEnd"/>
+      <w:r>
+        <w:t xml:space="preserve"> </w:t>
+      </w:r>
+      <w:proofErr w:type="spellStart"/>
+      <w:r>
+        <w:t>wymaga</w:t>
+      </w:r>
+      <w:proofErr w:type="spellEnd"/>
+      <w:r>
+        <w:t xml:space="preserve"> </w:t>
+      </w:r>
+      <w:proofErr w:type="spellStart"/>
+      <w:r>
+        <w:t>blokady</w:t>
+      </w:r>
+      <w:proofErr w:type="spellEnd"/>
+      <w:r>
+        <w:t xml:space="preserve"> </w:t>
+      </w:r>
+      <w:proofErr w:type="spellStart"/>
+      <w:r>
+        <w:t>prób</w:t>
+      </w:r>
+      <w:proofErr w:type="spellEnd"/>
+      <w:r>
+        <w:t xml:space="preserve"> </w:t>
+      </w:r>
+      <w:proofErr w:type="spellStart"/>
+      <w:r>
+        <w:t>logowania</w:t>
+      </w:r>
+      <w:proofErr w:type="spellEnd"/>
+      <w:r>
+        <w:t xml:space="preserve"> </w:t>
+      </w:r>
+      <w:proofErr w:type="spellStart"/>
+      <w:r>
+        <w:t>zamiast</w:t>
+      </w:r>
+      <w:proofErr w:type="spellEnd"/>
+      <w:r>
+        <w:t xml:space="preserve"> </w:t>
+      </w:r>
+      <w:proofErr w:type="spellStart"/>
+      <w:r>
+        <w:t>podnoszenia</w:t>
+      </w:r>
+      <w:proofErr w:type="spellEnd"/>
+      <w:r>
+        <w:t xml:space="preserve"> </w:t>
+      </w:r>
+      <w:proofErr w:type="spellStart"/>
+      <w:r>
+        <w:t>wymogu</w:t>
+      </w:r>
+      <w:proofErr w:type="spellEnd"/>
+      <w:r>
+        <w:t xml:space="preserve"> </w:t>
+      </w:r>
+      <w:proofErr w:type="spellStart"/>
+      <w:r>
+        <w:t>długości</w:t>
+      </w:r>
+      <w:proofErr w:type="spellEnd"/>
     </w:p>
     <w:p>
       <w:pPr>
@@ -2635,22 +2826,81 @@
       </w:pPr>
       <w:proofErr w:type="spellStart"/>
       <w:r>
-        <w:t>Uśpiony Prisma/NextAuth oraz zdublowane pliki danych kalkulatora (calc-data.ts / calculatorData.ts) do uporządkowania</w:t>
-      </w:r>
-      <w:proofErr w:type="spellEnd"/>
-      <w:r/>
-      <w:proofErr w:type="spellStart"/>
-      <w:r/>
-      <w:proofErr w:type="spellEnd"/>
-      <w:r/>
-      <w:proofErr w:type="spellStart"/>
-      <w:r/>
-      <w:proofErr w:type="spellEnd"/>
-      <w:r/>
-      <w:proofErr w:type="spellStart"/>
-      <w:r/>
-      <w:proofErr w:type="spellEnd"/>
-      <w:r/>
+        <w:t>Uśpiony</w:t>
+      </w:r>
+      <w:proofErr w:type="spellEnd"/>
+      <w:r>
+        <w:t xml:space="preserve"> Prisma/</w:t>
+      </w:r>
+      <w:proofErr w:type="spellStart"/>
+      <w:r>
+        <w:t>NextAuth</w:t>
+      </w:r>
+      <w:proofErr w:type="spellEnd"/>
+      <w:r>
+        <w:t xml:space="preserve"> </w:t>
+      </w:r>
+      <w:proofErr w:type="spellStart"/>
+      <w:r>
+        <w:t>oraz</w:t>
+      </w:r>
+      <w:proofErr w:type="spellEnd"/>
+      <w:r>
+        <w:t xml:space="preserve"> </w:t>
+      </w:r>
+      <w:proofErr w:type="spellStart"/>
+      <w:r>
+        <w:t>zdublowane</w:t>
+      </w:r>
+      <w:proofErr w:type="spellEnd"/>
+      <w:r>
+        <w:t xml:space="preserve"> </w:t>
+      </w:r>
+      <w:proofErr w:type="spellStart"/>
+      <w:r>
+        <w:t>pliki</w:t>
+      </w:r>
+      <w:proofErr w:type="spellEnd"/>
+      <w:r>
+        <w:t xml:space="preserve"> </w:t>
+      </w:r>
+      <w:proofErr w:type="spellStart"/>
+      <w:r>
+        <w:t>danych</w:t>
+      </w:r>
+      <w:proofErr w:type="spellEnd"/>
+      <w:r>
+        <w:t xml:space="preserve"> </w:t>
+      </w:r>
+      <w:proofErr w:type="spellStart"/>
+      <w:r>
+        <w:t>kalkulatora</w:t>
+      </w:r>
+      <w:proofErr w:type="spellEnd"/>
+      <w:r>
+        <w:t xml:space="preserve"> (calc-</w:t>
+      </w:r>
+      <w:proofErr w:type="spellStart"/>
+      <w:r>
+        <w:t>data.ts</w:t>
+      </w:r>
+      <w:proofErr w:type="spellEnd"/>
+      <w:r>
+        <w:t xml:space="preserve"> / </w:t>
+      </w:r>
+      <w:proofErr w:type="spellStart"/>
+      <w:r>
+        <w:t>calculatorData.ts</w:t>
+      </w:r>
+      <w:proofErr w:type="spellEnd"/>
+      <w:r>
+        <w:t xml:space="preserve">) do </w:t>
+      </w:r>
+      <w:proofErr w:type="spellStart"/>
+      <w:r>
+        <w:t>uporządkowania</w:t>
+      </w:r>
+      <w:proofErr w:type="spellEnd"/>
     </w:p>
     <w:p>
       <w:pPr>
@@ -2902,7 +3152,6 @@
       </w:pPr>
       <w:proofErr w:type="spellStart"/>
       <w:r>
-        <w:lastRenderedPageBreak/>
         <w:t>Stworzenie</w:t>
       </w:r>
       <w:proofErr w:type="spellEnd"/>

</xml_diff>

<commit_message>
fix: security-harden JWT secret, surface silent surcharge fallback, remove dead code
- lib/jwtSecret.ts: centralize JWT_SECRET, fail fast instead of silently
  falling back to a hardcoded default (auth.ts + middleware.ts, all 4 branches)
- Calculator.tsx + translations.ts: show a visible warning when the base
  surcharge falls back to an estimated value instead of silently using it
- Remove dead code: lib/calc-data.ts (superseded pricing tables, zero
  importers), lib/rbac.ts requireRoleFromToken (unused), lib/pdfGenerator.ts
  client-side PDF generator + jspdf/jspdf-autotable deps (superseded by
  server-side PDF generation, keeps only the still-used ClientInfo type)
</commit_message>
<xml_diff>
--- a/Historia wersji oraz md/Historia wersji/AMSteel_Quote_Raport_Wersji_1.2.docx
+++ b/Historia wersji oraz md/Historia wersji/AMSteel_Quote_Raport_Wersji_1.2.docx
@@ -2497,83 +2497,6 @@
       </w:pPr>
       <w:proofErr w:type="spellStart"/>
       <w:r>
-        <w:t>Powłoka</w:t>
-      </w:r>
-      <w:proofErr w:type="spellEnd"/>
-      <w:r>
-        <w:t xml:space="preserve"> (np. Z275) </w:t>
-      </w:r>
-      <w:proofErr w:type="spellStart"/>
-      <w:r>
-        <w:t>nie</w:t>
-      </w:r>
-      <w:proofErr w:type="spellEnd"/>
-      <w:r>
-        <w:t xml:space="preserve"> jest </w:t>
-      </w:r>
-      <w:proofErr w:type="spellStart"/>
-      <w:r>
-        <w:t>zapisywana</w:t>
-      </w:r>
-      <w:proofErr w:type="spellEnd"/>
-      <w:r>
-        <w:t xml:space="preserve"> per </w:t>
-      </w:r>
-      <w:proofErr w:type="spellStart"/>
-      <w:r>
-        <w:t>pozycja</w:t>
-      </w:r>
-      <w:proofErr w:type="spellEnd"/>
-      <w:r>
-        <w:t xml:space="preserve"> </w:t>
-      </w:r>
-      <w:proofErr w:type="spellStart"/>
-      <w:r>
-        <w:t>i</w:t>
-      </w:r>
-      <w:proofErr w:type="spellEnd"/>
-      <w:r>
-        <w:t xml:space="preserve"> </w:t>
-      </w:r>
-      <w:proofErr w:type="spellStart"/>
-      <w:r>
-        <w:t>nie</w:t>
-      </w:r>
-      <w:proofErr w:type="spellEnd"/>
-      <w:r>
-        <w:t xml:space="preserve"> </w:t>
-      </w:r>
-      <w:proofErr w:type="spellStart"/>
-      <w:r>
-        <w:t>pojawia</w:t>
-      </w:r>
-      <w:proofErr w:type="spellEnd"/>
-      <w:r>
-        <w:t xml:space="preserve"> </w:t>
-      </w:r>
-      <w:proofErr w:type="spellStart"/>
-      <w:r>
-        <w:t>się</w:t>
-      </w:r>
-      <w:proofErr w:type="spellEnd"/>
-      <w:r>
-        <w:t xml:space="preserve"> w </w:t>
-      </w:r>
-      <w:proofErr w:type="spellStart"/>
-      <w:r>
-        <w:t>eksporcie</w:t>
-      </w:r>
-      <w:proofErr w:type="spellEnd"/>
-      <w:r>
-        <w:t xml:space="preserve"> PDF</w:t>
-      </w:r>
-    </w:p>
-    <w:p>
-      <w:pPr>
-        <w:pStyle w:val="Listapunktowana"/>
-      </w:pPr>
-      <w:proofErr w:type="spellStart"/>
-      <w:r>
         <w:t>Pokrywa</w:t>
       </w:r>
       <w:proofErr w:type="spellEnd"/>

</xml_diff>